<commit_message>
Update education to final year student and set resume download to PDF
</commit_message>
<xml_diff>
--- a/Paul-Karonji-Waithaka-Resume.docx
+++ b/Paul-Karonji-Waithaka-Resume.docx
@@ -97,7 +97,7 @@
         <w:rPr>
           <w:color w:val="auto"/>
         </w:rPr>
-        <w:t>Full-stack software engineer and founder with 3+ years delivering production-grade systems across enterprise, SaaS, mobile, and AI domains. BSc Software Development graduate (KCA University, Dec 2025). Founded WIK Technologies, shipping hardware-licensed POS systems, a property marketplace, AI agents, and consumer PWAs — all serving live users. Deep expertise in offline-first architecture, emerging-market payment integrations (M-Pesa, Paystack), and building complete product ecosystems from zero to production. Comfortable from Electron desktop to React Native mobile to multi-tenant Laravel Saa</w:t>
+        <w:t>Full-stack software engineer and founder with 3+ years delivering production-grade systems across enterprise, SaaS, mobile, and AI domains. Final year student at KCA University (BSc Software Development). Founded WIK Technologies, shipping hardware-licensed POS systems, a property marketplace, AI agents, and consumer PWAs — all serving live users. Deep expertise in offline-first architecture, emerging-market payment integrations (M-Pesa, Paystack), and building complete product ecosystems from zero to production. Comfortable from Electron desktop to React Native mobile to multi-tenant Laravel Saa</w:t>
       </w:r>
       <w:bookmarkStart w:id="0" w:name="_GoBack"/>
       <w:bookmarkEnd w:id="0"/>
@@ -1769,7 +1769,7 @@
           <w:sz w:val="18"/>
           <w:szCs w:val="18"/>
         </w:rPr>
-        <w:t>Sep 2021 – Dec 2025</w:t>
+        <w:t>Sep 2021 – Present</w:t>
       </w:r>
     </w:p>
     <w:p>
@@ -1785,7 +1785,7 @@
           <w:sz w:val="18"/>
           <w:szCs w:val="18"/>
         </w:rPr>
-        <w:t>Nairobi, Kenya</w:t>
+        <w:t>Final Year Student · Nairobi, Kenya</w:t>
       </w:r>
     </w:p>
     <w:p>

</xml_diff>